<commit_message>
Growth: apartado cualitativo obligatorio (foso, IA, ciclo y sector, mercado con fuente; G12) y MongoDB completado con comparables verificados
Co-Authored-By: Claude Opus 5.5 (1M context) <noreply@anthropic.com>
Claude-Session: https://claude.ai/code/session_013SHGWikVfd4zE5n7xxJPas
</commit_message>
<xml_diff>
--- a/informes-growth/mongodb-2026-10-14/MongoDB - growth - 2026-10-14.docx
+++ b/informes-growth/mongodb-2026-10-14/MongoDB - growth - 2026-10-14.docx
@@ -2,7 +2,7 @@
 <file path=word/document.xml><?xml version="1.0" encoding="utf-8"?>
 <w:document xmlns:w="http://schemas.openxmlformats.org/wordprocessingml/2006/main" xmlns:m="http://schemas.openxmlformats.org/officeDocument/2006/math" xmlns:r="http://schemas.openxmlformats.org/officeDocument/2006/relationships" xmlns:o="urn:schemas-microsoft-com:office:office" xmlns:v="urn:schemas-microsoft-com:vml" xmlns:w10="urn:schemas-microsoft-com:office:word" xmlns:a="http://schemas.openxmlformats.org/drawingml/2006/main" xmlns:pic="http://schemas.openxmlformats.org/drawingml/2006/picture" xmlns:wp="http://schemas.openxmlformats.org/drawingml/2006/wordprocessingDrawing">
   <w:body>
-    <w:bookmarkStart w:id="36" w:name="mongodb-mdb-análisis-growth-14-oct-2026"/>
+    <w:bookmarkStart w:id="37" w:name="mongodb-mdb-análisis-growth-14-oct-2026"/>
     <w:p>
       <w:pPr>
         <w:pStyle w:val="Heading1"/>
@@ -33,6 +33,69 @@
       </w:r>
       <w:r>
         <w:t xml:space="preserve">Precio 373,07 USD (fecha del informe) · Objetivo 12 m 439,5 USD · Ponderada +17,8 % · Base +11,6 % · Bajista −38,6 % · Alcista +86,6 % · Compra hasta 416,4 USD</w:t>
+      </w:r>
+    </w:p>
+    <w:p>
+      <w:pPr>
+        <w:pStyle w:val="BlockText"/>
+      </w:pPr>
+      <w:r>
+        <w:rPr>
+          <w:bCs/>
+          <w:b/>
+        </w:rPr>
+        <w:t xml:space="preserve">Actualización del 20-oct-2026 (sin investigación nueva del negocio; el resto del informe es del 14-oct).</w:t>
+      </w:r>
+      <w:r>
+        <w:t xml:space="preserve"> </w:t>
+      </w:r>
+      <w:r>
+        <w:t xml:space="preserve">(1) Apartado 4 bis añadido (foso, riesgo de IA, ciclo y sector, mercado con fuente: Gartner). (2)</w:t>
+      </w:r>
+      <w:r>
+        <w:t xml:space="preserve"> </w:t>
+      </w:r>
+      <w:r>
+        <w:rPr>
+          <w:bCs/>
+          <w:b/>
+        </w:rPr>
+        <w:t xml:space="preserve">Comparables verificados con una sola fuente: mediana 12,3x, no ~14x</w:t>
+      </w:r>
+      <w:r>
+        <w:t xml:space="preserve"> </w:t>
+      </w:r>
+      <w:r>
+        <w:t xml:space="preserve">(el ~14x salía en parte de memoria). El múltiplo alcista baja de 13,4x a 12,3x:</w:t>
+      </w:r>
+      <w:r>
+        <w:t xml:space="preserve"> </w:t>
+      </w:r>
+      <w:r>
+        <w:rPr>
+          <w:bCs/>
+          <w:b/>
+        </w:rPr>
+        <w:t xml:space="preserve">objetivo 12 m 425,5 USD (antes 439,5)</w:t>
+      </w:r>
+      <w:r>
+        <w:t xml:space="preserve">, ponderada al precio del informe +14,1 % (antes +17,8 %), compra hasta v11 405,3 USD. La señal v11 sigue siendo Comprar (convicción baja). Con las reglas del 20-oct (+25 % a 12 m y rentabilidad ≥ 0,75 veces la caída del escenario malo, las dos al precio de hoy),</w:t>
+      </w:r>
+      <w:r>
+        <w:t xml:space="preserve"> </w:t>
+      </w:r>
+      <w:r>
+        <w:rPr>
+          <w:bCs/>
+          <w:b/>
+        </w:rPr>
+        <w:t xml:space="preserve">el límite queda en 340,40 USD</w:t>
+      </w:r>
+      <w:r>
+        <w:t xml:space="preserve"> </w:t>
+      </w:r>
+      <w:r>
+        <w:t xml:space="preserve">(antes 349,37). A 348,69 USD (cierre del 19-oct) da +22,0 % con un escenario malo de −34,3 % (0,64 veces): hoy no es compra. Donde las secciones 9 y 13 citan 439,5 USD, +17,8 % o el alcista de 13,4x, valen las cifras de esta nota.</w:t>
       </w:r>
       <w:r>
         <w:t xml:space="preserve"> </w:t>
@@ -1323,7 +1386,7 @@
         <w:t xml:space="preserve">Mercado alcanzable: ~100.000 M USD en 2028</w:t>
       </w:r>
       <w:r>
-        <w:t xml:space="preserve">: el mercado de software de bases de datos (IDC/Gartner, de memoria, sin verificar en esta sesión) [14]. Con cualquier cifra entre 56.000 y 139.000 M la penetración puntúa igual.</w:t>
+        <w:t xml:space="preserve">: la parte operativa de un mercado de bases de datos de 119.700 M en 2024 y ~161.000 M previstos en 2026 (Gartner; verificado el 20-oct, ver 4 bis). Con cualquier cifra entre 56.000 y 139.000 M la penetración puntúa igual.</w:t>
       </w:r>
     </w:p>
     <w:p>
@@ -1711,7 +1774,375 @@
     </w:p>
     <w:bookmarkEnd w:id="23"/>
     <w:bookmarkEnd w:id="24"/>
-    <w:bookmarkStart w:id="25" w:name="cambio-de-tendencia"/>
+    <w:bookmarkStart w:id="25" w:name="X6d4b6f66b5ce1a0c1a2a6e3ffb87e0499ba8f62"/>
+    <w:p>
+      <w:pPr>
+        <w:pStyle w:val="Heading2"/>
+      </w:pPr>
+      <w:r>
+        <w:t xml:space="preserve">4 bis. Foso, riesgo de IA y sector (añadido el 20-oct-2026)</w:t>
+      </w:r>
+    </w:p>
+    <w:p>
+      <w:pPr>
+        <w:pStyle w:val="FirstParagraph"/>
+      </w:pPr>
+      <w:r>
+        <w:t xml:space="preserve">Apartado obligatorio desde el 20-oct (decisión de Hotis). No cambia ninguna cifra del cálculo.</w:t>
+      </w:r>
+    </w:p>
+    <w:tbl>
+      <w:tblPr>
+        <w:tblStyle w:val="Table"/>
+        <w:tblW w:type="pct" w:w="5000"/>
+        <w:tblLook w:firstRow="1" w:lastRow="0" w:firstColumn="0" w:lastColumn="0" w:noHBand="0" w:noVBand="0" w:val="0020"/>
+        <w:jc w:val="start"/>
+      </w:tblPr>
+      <w:tblGrid>
+        <w:gridCol w:w="2640"/>
+        <w:gridCol w:w="2640"/>
+        <w:gridCol w:w="2640"/>
+      </w:tblGrid>
+      <w:tr>
+        <w:trPr>
+          <w:tblHeader w:val="true"/>
+        </w:trPr>
+        <w:tc>
+          <w:tcPr/>
+          <w:p>
+            <w:pPr>
+              <w:pStyle w:val="Compact"/>
+              <w:jc w:val="left"/>
+            </w:pPr>
+            <w:r>
+              <w:t xml:space="preserve">Aspecto</w:t>
+            </w:r>
+          </w:p>
+        </w:tc>
+        <w:tc>
+          <w:tcPr/>
+          <w:p>
+            <w:pPr>
+              <w:pStyle w:val="Compact"/>
+              <w:jc w:val="left"/>
+            </w:pPr>
+            <w:r>
+              <w:t xml:space="preserve">Veredicto</w:t>
+            </w:r>
+          </w:p>
+        </w:tc>
+        <w:tc>
+          <w:tcPr/>
+          <w:p>
+            <w:pPr>
+              <w:pStyle w:val="Compact"/>
+              <w:jc w:val="left"/>
+            </w:pPr>
+            <w:r>
+              <w:t xml:space="preserve">Pruebas</w:t>
+            </w:r>
+          </w:p>
+        </w:tc>
+      </w:tr>
+      <w:tr>
+        <w:tc>
+          <w:tcPr/>
+          <w:p>
+            <w:pPr>
+              <w:pStyle w:val="Compact"/>
+              <w:jc w:val="left"/>
+            </w:pPr>
+            <w:r>
+              <w:t xml:space="preserve">Foso (costes de cambio, escala)</w:t>
+            </w:r>
+          </w:p>
+        </w:tc>
+        <w:tc>
+          <w:tcPr/>
+          <w:p>
+            <w:pPr>
+              <w:pStyle w:val="Compact"/>
+              <w:jc w:val="left"/>
+            </w:pPr>
+            <w:r>
+              <w:rPr>
+                <w:bCs/>
+                <w:b/>
+              </w:rPr>
+              <w:t xml:space="preserve">medio</w:t>
+            </w:r>
+          </w:p>
+        </w:tc>
+        <w:tc>
+          <w:tcPr/>
+          <w:p>
+            <w:pPr>
+              <w:pStyle w:val="Compact"/>
+              <w:jc w:val="left"/>
+            </w:pPr>
+            <w:r>
+              <w:t xml:space="preserve">Retención neta de ARR 122 % (2T FY27; 119 % un año antes): los clientes que se quedan gastan un 22 % más cada año [1][10]; 2.999 clientes de más de 100.000 USD de ARR (+17 %) y ~75 % de la Fortune 100: aplicaciones de misión crítica, caras de migrar [1]; Cuota: ventas de ~2.000 M USD en 2024 frente a un mercado de 119.700 M (≈1,7 %), con los no relacionales creciendo al 22,7 % frente al 10,8 % de los relacionales [15]; Margen bruto estable del 72-74 % con Atlas ya ~73 % de las ventas: no compite por precio [1][11]</w:t>
+            </w:r>
+          </w:p>
+        </w:tc>
+      </w:tr>
+      <w:tr>
+        <w:tc>
+          <w:tcPr/>
+          <w:p>
+            <w:pPr>
+              <w:pStyle w:val="Compact"/>
+              <w:jc w:val="left"/>
+            </w:pPr>
+            <w:r>
+              <w:t xml:space="preserve">Riesgo de IA</w:t>
+            </w:r>
+          </w:p>
+        </w:tc>
+        <w:tc>
+          <w:tcPr/>
+          <w:p>
+            <w:pPr>
+              <w:pStyle w:val="Compact"/>
+              <w:jc w:val="left"/>
+            </w:pPr>
+            <w:r>
+              <w:rPr>
+                <w:bCs/>
+                <w:b/>
+              </w:rPr>
+              <w:t xml:space="preserve">presiona, nivel medio</w:t>
+            </w:r>
+          </w:p>
+        </w:tc>
+        <w:tc>
+          <w:tcPr/>
+          <w:p>
+            <w:pPr>
+              <w:pStyle w:val="Compact"/>
+              <w:jc w:val="left"/>
+            </w:pPr>
+            <w:r>
+              <w:t xml:space="preserve">La IA no sustituye el producto (lo necesita), pero baja el coste de cambiarse y empuja los proyectos nuevos hacia Postgres (detalle en la sección 4). Vigilar: Altas netas de clientes &lt; 2.000 por trimestre dos veces seguidas; Atlas &lt; 22 % dos trimestres seguidos; Retención neta &lt; 115 %.</w:t>
+            </w:r>
+          </w:p>
+        </w:tc>
+      </w:tr>
+      <w:tr>
+        <w:tc>
+          <w:tcPr/>
+          <w:p>
+            <w:pPr>
+              <w:pStyle w:val="Compact"/>
+              <w:jc w:val="left"/>
+            </w:pPr>
+            <w:r>
+              <w:t xml:space="preserve">Ciclo</w:t>
+            </w:r>
+          </w:p>
+        </w:tc>
+        <w:tc>
+          <w:tcPr/>
+          <w:p>
+            <w:pPr>
+              <w:pStyle w:val="Compact"/>
+              <w:jc w:val="left"/>
+            </w:pPr>
+            <w:r>
+              <w:rPr>
+                <w:bCs/>
+                <w:b/>
+              </w:rPr>
+              <w:t xml:space="preserve">sensibilidad media</w:t>
+            </w:r>
+          </w:p>
+        </w:tc>
+        <w:tc>
+          <w:tcPr/>
+          <w:p>
+            <w:pPr>
+              <w:pStyle w:val="Compact"/>
+              <w:jc w:val="left"/>
+            </w:pPr>
+            <w:r>
+              <w:t xml:space="preserve">Atlas se cobra por consumo: en el bache de 2022-2023 los clientes optimizaron uso y el consumo frenó desde el verano de 2022; Atlas pasó a +37 % en FY24 y en mayo de 2024 la empresa recortó la guía por menor consumo [16]. No es cíclica como un industrial, pero una recesión recorta varios puntos de crecimiento en dos o tres trimestres.</w:t>
+            </w:r>
+          </w:p>
+        </w:tc>
+      </w:tr>
+      <w:tr>
+        <w:tc>
+          <w:tcPr/>
+          <w:p>
+            <w:pPr>
+              <w:pStyle w:val="Compact"/>
+              <w:jc w:val="left"/>
+            </w:pPr>
+            <w:r>
+              <w:t xml:space="preserve">Regulación</w:t>
+            </w:r>
+          </w:p>
+        </w:tc>
+        <w:tc>
+          <w:tcPr/>
+          <w:p>
+            <w:pPr>
+              <w:pStyle w:val="Compact"/>
+              <w:jc w:val="left"/>
+            </w:pPr>
+            <w:r>
+              <w:t xml:space="preserve">baja</w:t>
+            </w:r>
+          </w:p>
+        </w:tc>
+        <w:tc>
+          <w:tcPr/>
+          <w:p>
+            <w:pPr>
+              <w:pStyle w:val="Compact"/>
+              <w:jc w:val="left"/>
+            </w:pPr>
+            <w:r>
+              <w:t xml:space="preserve">Sin riesgo relevante (residencia de datos y privacidad, que favorecen a quien funciona en cualquier nube).</w:t>
+            </w:r>
+          </w:p>
+        </w:tc>
+      </w:tr>
+      <w:tr>
+        <w:tc>
+          <w:tcPr/>
+          <w:p>
+            <w:pPr>
+              <w:pStyle w:val="Compact"/>
+              <w:jc w:val="left"/>
+            </w:pPr>
+            <w:r>
+              <w:t xml:space="preserve">Estructura del sector</w:t>
+            </w:r>
+          </w:p>
+        </w:tc>
+        <w:tc>
+          <w:tcPr/>
+          <w:p>
+            <w:pPr>
+              <w:pStyle w:val="Compact"/>
+              <w:jc w:val="left"/>
+            </w:pPr>
+            <w:r>
+              <w:t xml:space="preserve">—</w:t>
+            </w:r>
+          </w:p>
+        </w:tc>
+        <w:tc>
+          <w:tcPr/>
+          <w:p>
+            <w:pPr>
+              <w:pStyle w:val="Compact"/>
+              <w:jc w:val="left"/>
+            </w:pPr>
+            <w:r>
+              <w:t xml:space="preserve">Mandan los hiperescaladores (AWS, Microsoft, Google, Oracle, IBM, los cinco primeros desde 2022) [17], que son a la vez socios (la mitad de las ventas pasan por sus marketplaces) y rivales (DocumentDB, Cosmos DB). El mercado va a la nube (64 %) y crece más en no relacionales [15].</w:t>
+            </w:r>
+          </w:p>
+        </w:tc>
+      </w:tr>
+      <w:tr>
+        <w:tc>
+          <w:tcPr/>
+          <w:p>
+            <w:pPr>
+              <w:pStyle w:val="Compact"/>
+              <w:jc w:val="left"/>
+            </w:pPr>
+            <w:r>
+              <w:t xml:space="preserve">Por qué podría perder</w:t>
+            </w:r>
+          </w:p>
+        </w:tc>
+        <w:tc>
+          <w:tcPr/>
+          <w:p>
+            <w:pPr>
+              <w:pStyle w:val="Compact"/>
+              <w:jc w:val="left"/>
+            </w:pPr>
+            <w:r>
+              <w:t xml:space="preserve">—</w:t>
+            </w:r>
+          </w:p>
+        </w:tc>
+        <w:tc>
+          <w:tcPr/>
+          <w:p>
+            <w:pPr>
+              <w:pStyle w:val="Compact"/>
+              <w:jc w:val="left"/>
+            </w:pPr>
+            <w:r>
+              <w:t xml:space="preserve">Postgres gratis, «suficiente» para la mayoría de los casos (JSONB, pgvector) y elegido por defecto por los agentes y las plataformas de IA; los hiperescaladores ofrecen copias compatibles con la API de MongoDB dentro de lo que el cliente ya paga. Si los proyectos nuevos se quedan en Postgres, MongoDB vive de la base instalada y el crecimiento baja hacia el 15 %.</w:t>
+            </w:r>
+          </w:p>
+        </w:tc>
+      </w:tr>
+      <w:tr>
+        <w:tc>
+          <w:tcPr/>
+          <w:p>
+            <w:pPr>
+              <w:pStyle w:val="Compact"/>
+              <w:jc w:val="left"/>
+            </w:pPr>
+            <w:r>
+              <w:t xml:space="preserve">Mercado alcanzable (fuente)</w:t>
+            </w:r>
+          </w:p>
+        </w:tc>
+        <w:tc>
+          <w:tcPr/>
+          <w:p>
+            <w:pPr>
+              <w:pStyle w:val="Compact"/>
+              <w:jc w:val="left"/>
+            </w:pPr>
+            <w:r>
+              <w:t xml:space="preserve">~100.000 M USD en 2028</w:t>
+            </w:r>
+          </w:p>
+        </w:tc>
+        <w:tc>
+          <w:tcPr/>
+          <w:p>
+            <w:pPr>
+              <w:pStyle w:val="Compact"/>
+              <w:jc w:val="left"/>
+            </w:pPr>
+            <w:r>
+              <w:t xml:space="preserve">Gartner: DBMS 119.700 M USD en 2024 y ~161.000 M previstos en 2026 [15]. Se toma como alcanzable en 2028 ~100.000 M: la parte operativa (sin analítica, donde mandan Snowflake, Databricks y BigQuery); la proporción operativa/analítica es estimación propia. Con cualquier cifra entre 56.000 y 139.000 M la penetración puntúa igual.</w:t>
+            </w:r>
+          </w:p>
+        </w:tc>
+      </w:tr>
+    </w:tbl>
+    <w:p>
+      <w:pPr>
+        <w:pStyle w:val="BodyText"/>
+      </w:pPr>
+      <w:r>
+        <w:rPr>
+          <w:bCs/>
+          <w:b/>
+        </w:rPr>
+        <w:t xml:space="preserve">Lectura:</w:t>
+      </w:r>
+      <w:r>
+        <w:t xml:space="preserve"> </w:t>
+      </w:r>
+      <w:r>
+        <w:t xml:space="preserve">foso medio, no fuerte. Los clientes que ya la usan se quedan y gastan más (retención neta del 122 %), pero el riesgo está en los proyectos nuevos. La IA presiona sin sustituir, y el consumo hace que frene en una recesión. Nada de esto rompe la tesis. Encaja con la puntuación que ya tenía (tecnología 3/5, posición 4/5) y con la convicción baja.</w:t>
+      </w:r>
+    </w:p>
+    <w:bookmarkEnd w:id="25"/>
+    <w:bookmarkStart w:id="26" w:name="cambio-de-tendencia"/>
     <w:p>
       <w:pPr>
         <w:pStyle w:val="Heading2"/>
@@ -2314,8 +2745,8 @@
         <w:t xml:space="preserve">(+16,9 % en 12 meses; EV/beneficio bruto 12,1x). Es el caso contrario a Datadog y Snowflake: el negocio acelera pero la percepción se ha enfriado.</w:t>
       </w:r>
     </w:p>
-    <w:bookmarkEnd w:id="25"/>
-    <w:bookmarkStart w:id="26" w:name="X6a3ced9ea5ed5bb9ac58f5e7c1bb09ad4718b77"/>
+    <w:bookmarkEnd w:id="26"/>
+    <w:bookmarkStart w:id="27" w:name="X6a3ced9ea5ed5bb9ac58f5e7c1bb09ad4718b77"/>
     <w:p>
       <w:pPr>
         <w:pStyle w:val="Heading2"/>
@@ -2471,8 +2902,8 @@
         <w:t xml:space="preserve">: margen operativo no GAAP del 24 % en el 2T (15 % un año antes); guía del año ~21 %; objetivo de +100-200 pb al año [1][4]. GAAP: tres trimestres seguidos con beneficio por acción.</w:t>
       </w:r>
     </w:p>
-    <w:bookmarkEnd w:id="26"/>
-    <w:bookmarkStart w:id="27" w:name="caja-deuda-y-dilución"/>
+    <w:bookmarkEnd w:id="27"/>
+    <w:bookmarkStart w:id="28" w:name="caja-deuda-y-dilución"/>
     <w:p>
       <w:pPr>
         <w:pStyle w:val="Heading2"/>
@@ -2659,8 +3090,8 @@
         <w:t xml:space="preserve">Bajan en proporción (22 % un año antes), pero el FCF «real» para el accionista es solo del 3 %.</w:t>
       </w:r>
     </w:p>
-    <w:bookmarkEnd w:id="27"/>
-    <w:bookmarkStart w:id="28" w:name="dirección-y-ejecución"/>
+    <w:bookmarkEnd w:id="28"/>
+    <w:bookmarkStart w:id="29" w:name="dirección-y-ejecución"/>
     <w:p>
       <w:pPr>
         <w:pStyle w:val="Heading2"/>
@@ -2739,8 +3170,8 @@
         <w:t xml:space="preserve">(28-sep). Vuelve como interino Dev Ittycheria (CEO de 2014 a 2025, conoce la empresa y llevó las ventas de 35 a 2.300 M USD), ahora también socio de Sequoia, y el consejo busca CEO definitivo [3]. El 13-oct salieron la directora de clientes (Erica Volini, fichada en marzo) y el jefe de producto de IA (Pablo Stern-Plaza); siguen el CTO, el director comercial y el director financiero [8]. A favor: asignación de capital sensata (caja neta, recompras de 600 M en 18 meses, beneficio GAAP). En contra: rotación en la cúpula, pagos en acciones del 20 % y solo ventas de directivos.</w:t>
       </w:r>
     </w:p>
-    <w:bookmarkEnd w:id="28"/>
-    <w:bookmarkStart w:id="29" w:name="valoración"/>
+    <w:bookmarkEnd w:id="29"/>
+    <w:bookmarkStart w:id="30" w:name="valoración"/>
     <w:p>
       <w:pPr>
         <w:pStyle w:val="Heading2"/>
@@ -3778,8 +4209,8 @@
         <w:t xml:space="preserve">frente al objetivo de +20 % y el +25 % actual.</w:t>
       </w:r>
     </w:p>
-    <w:bookmarkEnd w:id="29"/>
-    <w:bookmarkStart w:id="30" w:name="foros-y-sentimiento"/>
+    <w:bookmarkEnd w:id="30"/>
+    <w:bookmarkStart w:id="31" w:name="foros-y-sentimiento"/>
     <w:p>
       <w:pPr>
         <w:pStyle w:val="Heading2"/>
@@ -3941,8 +4372,8 @@
         <w:t xml:space="preserve">: el sentimiento va peor que el negocio (aceleración, margen y retención al alza). Es el terreno en el que el método busca compras, con el matiz de que la rotación directiva es un riesgo real, no solo de percepción.</w:t>
       </w:r>
     </w:p>
-    <w:bookmarkEnd w:id="30"/>
-    <w:bookmarkStart w:id="31" w:name="riesgos-y-qué-rompería-la-tesis"/>
+    <w:bookmarkEnd w:id="31"/>
+    <w:bookmarkStart w:id="32" w:name="riesgos-y-qué-rompería-la-tesis"/>
     <w:p>
       <w:pPr>
         <w:pStyle w:val="Heading2"/>
@@ -4118,8 +4549,8 @@
         <w:t xml:space="preserve">Hoy no hay tesis rota.</w:t>
       </w:r>
     </w:p>
-    <w:bookmarkEnd w:id="31"/>
-    <w:bookmarkStart w:id="32" w:name="catalizadores-con-fecha"/>
+    <w:bookmarkEnd w:id="32"/>
+    <w:bookmarkStart w:id="33" w:name="catalizadores-con-fecha"/>
     <w:p>
       <w:pPr>
         <w:pStyle w:val="Heading2"/>
@@ -4372,8 +4803,8 @@
         </w:tc>
       </w:tr>
     </w:tbl>
-    <w:bookmarkEnd w:id="32"/>
-    <w:bookmarkStart w:id="33" w:name="encaje-en-cartera"/>
+    <w:bookmarkEnd w:id="33"/>
+    <w:bookmarkStart w:id="34" w:name="encaje-en-cartera"/>
     <w:p>
       <w:pPr>
         <w:pStyle w:val="Heading2"/>
@@ -4838,8 +5269,8 @@
         <w:t xml:space="preserve">(el máximo de compra sin contar los comparables, más prudente que los 443 de la regla).</w:t>
       </w:r>
     </w:p>
-    <w:bookmarkEnd w:id="33"/>
-    <w:bookmarkStart w:id="34" w:name="puntuación"/>
+    <w:bookmarkEnd w:id="34"/>
+    <w:bookmarkStart w:id="35" w:name="puntuación"/>
     <w:p>
       <w:pPr>
         <w:pStyle w:val="Heading2"/>
@@ -5358,8 +5789,8 @@
         <w:t xml:space="preserve">3. La regla min(mecánico, guía + exceso) se confirma útil y poco agresiva: en MongoDB resta solo 2 pp porque la empresa guía muy por debajo de lo que hace.</w:t>
       </w:r>
     </w:p>
-    <w:bookmarkEnd w:id="34"/>
-    <w:bookmarkStart w:id="35" w:name="fuentes"/>
+    <w:bookmarkEnd w:id="35"/>
+    <w:bookmarkStart w:id="36" w:name="fuentes"/>
     <w:p>
       <w:pPr>
         <w:pStyle w:val="Heading2"/>
@@ -5467,8 +5898,8 @@
         <w:t xml:space="preserve">: tamaño del mercado de bases de datos (IDC/Gartner); múltiplos de Elastic y ServiceNow (este, de un mensaje de StockTwits); Snowflake y Datadog salen de los informes growth del repo del 14-oct.</w:t>
       </w:r>
     </w:p>
-    <w:bookmarkEnd w:id="35"/>
     <w:bookmarkEnd w:id="36"/>
+    <w:bookmarkEnd w:id="37"/>
     <w:sectPr/>
   </w:body>
 </w:document>

</xml_diff>